<commit_message>
Sushi Restaurant Business Plan Kit EN · F2 cerrada: revisión adversarial (0 B · 2 M · 14 m, todos arreglados), 4 entregables regenerados (G1-G9 TODO VERDE, canon 4/4 IGUAL), F2-NOTAS y REVISION-FINAL
Via: Claude Code
Co-Authored-By: Claude Opus 5.5 <noreply@anthropic.com>
</commit_message>
<xml_diff>
--- a/astro-site/public/dl/sushi-restaurant-business-plan/sushi-restaurant-business-plan.docx
+++ b/astro-site/public/dl/sushi-restaurant-business-plan/sushi-restaurant-business-plan.docx
@@ -335,7 +335,7 @@
     </w:p>
     <w:p>
       <w:r>
-        <w:t>You are the owner and the general manager, and the head sushi chef is a hire who leads the bar. With them are a sushi chef, a part-time sushi chef for weekends and dinners, a kitchen line cook for tempura, gyoza and rice, servers who also host and pack to-go orders, and dish and prep help: 10 people on the payroll who add up to 8.60 full-time equivalents, all W-2 employees. The kit includes this ten-section business plan, the nine-sheet Sushi Restaurant Financial Projections in Excel, the 80-task Sushi Restaurant Startup Checklist, the Sushi Fish, Rice &amp; Costing Calculator and the Equivalents Guide. What sets it apart is the cost of every piece: the usable cost per pound of a whole salmon against a fillet, and how many nigiri a pound of raw rice yields, kit estimates that you measure yourself, plus the raw-fish and sushi-rice rules explained in plain English.</w:t>
+        <w:t>You are the owner and the general manager, and the head sushi chef is a hire who leads the bar. With them are a sushi chef, a part-time sushi chef for weekends and dinners, a kitchen line cook for tempura, gyoza and rice, servers who also host and pack to-go orders, and dish and prep help: 10 people counting you, who add up to 8.60 full-time equivalents; everyone else is a W-2 employee, and how you pay yourself is a question for your CPA. The kit includes this ten-section business plan, the nine-sheet Sushi Restaurant Financial Projections in Excel, the 80-task Sushi Restaurant Startup Checklist, the Sushi Fish, Rice &amp; Costing Calculator and the Equivalents Guide. What sets it apart is the cost of every piece: the usable cost per pound of a whole salmon against a fillet, and how many nigiri a pound of raw rice yields, kit estimates that you measure yourself, plus the raw-fish and sushi-rice rules explained in plain English.</w:t>
       </w:r>
     </w:p>
     <w:p>
@@ -372,7 +372,7 @@
     </w:p>
     <w:p>
       <w:r>
-        <w:t>The average check in the case is $32.50 per equivalent cover, excluding sales tax, which is $35.10 with tax, and it comes from three channels. A dine-in guest spends about $36.00 (food $28.50 plus drinks $7.50). A take-out order, at about $41.00 on average, is a platter and an extra or two and works out to about 25 covers a day. A marketplace order, with the menu 15% higher and a somewhat bigger basket, is about $46.00 and about 20 covers a day. Dine-in accounts for roughly 70 covers a day. The sales mix is 85% food and 15% beverage: drinks are about a fifth of what is sold at the tables and a small share of what goes out the door.</w:t>
+        <w:t>The average check in the case is $32.50 per equivalent cover, excluding sales tax, which is $35.10 with tax, and it comes from three channels. A dine-in guest spends about $36.00 (food $28.50 plus drinks $7.50). A take-out order, at about $41.00 on average, is a platter and an extra or two and works out to about 25 covers a day. A marketplace order, with the menu about 15% higher for about the same basket, is about $46.00 and about 20 covers a day. Dine-in accounts for roughly 70 covers a day. The sales mix is 85% food and 15% beverage: drinks are about a fifth of what is sold at the tables and a small share of what goes out the door.</w:t>
       </w:r>
     </w:p>
     <w:p>
@@ -409,7 +409,7 @@
     </w:p>
     <w:p>
       <w:r>
-        <w:t>On prices, we read the menus of small and mid-sized cities and added 10 to 20% to bring them to 2026. The kit estimate is nigiri at $5-7 a pair, classic rolls at $7-9, specialty rolls at $13-18 and sashimi at $28-65. Grocery store sushi and kiosks sit below that and anchor the low end of what a guest expects to pay, so compete on visible freshness, the chef at the bar and the menu, not on being the cheapest. The case prices inside that band.</w:t>
+        <w:t>On prices, we read the menus of small and mid-sized cities and added 10 to 20% to bring them to 2026. The kit estimate is nigiri at $5-7 a pair, classic rolls at $7-9, specialty rolls at $13-18 and sashimi at $28-65. Grocery store sushi and kiosks sit below that and anchor the low end of what a guest expects to pay, so compete on visible freshness, the chef at the bar and the menu, not on being the cheapest. The menu prices in the calculator are examples near that band (a little above it on tuna, the piece to watch): replace them with your own.</w:t>
       </w:r>
     </w:p>
     <w:p>
@@ -471,7 +471,7 @@
     </w:p>
     <w:p>
       <w:r>
-        <w:t>The SWOT for this concept is clear. Strengths: the head sushi chef in view, a short menu, platters costed by channel and a gross margin of 58.5% in year 1. Weaknesses: a space with hood requirements, a single head sushi chef and a cash margin of 26% over cash break-even that you have to protect. Opportunities: a product people search for constantly, the lunch special and pickup. Threats: the price of salmon and the marketplace, where the same 24-piece party platter leaves much less margin than it does dine-in. The defense is two suppliers, costing by channel and a second person who can cut.</w:t>
+        <w:t>The SWOT for this concept is clear. Strengths: the head sushi chef in view, a short menu, platters costed by channel and a gross margin of 58.5% in year 1. Weaknesses: a space with hood requirements, a single head sushi chef and a cash margin of 26% over cash break-even that you have to protect. Opportunities: a product people search for constantly, the lunch special and pickup. Threats: the price of salmon and the marketplace, where the same 24-piece party platter leaves about a fifth less margin than it does dine-in. The defense is two suppliers, costing by channel and a second person who can cut.</w:t>
       </w:r>
     </w:p>
     <w:p>
@@ -513,7 +513,7 @@
     </w:p>
     <w:p>
       <w:r>
-        <w:t>Marketplace or pickup is a numbers decision. The plan sells 15% of its sales through third-party delivery marketplaces and pays a commission of 25% on those orders. Published plans run from 15% to 30% on DoorDash and on Uber Eats, with Grubhub's fees on top, plus promotions and packaging. Your own driver costs wages, employer payroll taxes and auto insurance, and in most states must be a W-2 employee, so check yours. Whatever the channel, the consumer advisory for raw fish goes on your listings there too.</w:t>
+        <w:t>Marketplace or pickup is a numbers decision. The plan sells 15% of its sales through third-party delivery marketplaces and pays a commission of 25% on those orders. Published plans run from 15% to 30% on DoorDash and on Uber Eats, and Grubhub has its own tiers; promotions and packaging come on top. Your own driver costs wages, employer payroll taxes and auto insurance, and in most states must be a W-2 employee, so check yours. Whatever the channel, the consumer advisory for raw fish goes on your listings there too.</w:t>
       </w:r>
     </w:p>
     <w:p>
@@ -565,7 +565,7 @@
     </w:p>
     <w:p>
       <w:r>
-        <w:t>The case opens Tuesday through Sunday, 11:30 a.m. to 2:30 p.m. and 5:00 to 9:30 p.m., until 10:00 p.m. on Friday and Saturday. Production (the day's sushi rice, cutting the saku blocks and the sauces) is done before opening, so the head sushi chef starts at 9:30 a.m. You need two fish suppliers with their paperwork, supplier letters or farmed-fish statements, and one for sushi rice, nori and sauces with specification sheets. Prices move with the season and the catch, so keep a second quote on hand. Utilities average $1,700 a month, because the gas kitchen and the refrigeration run all day. Maintenance covers the semiannual hood cleaning, the refrigeration, the freezer that has to keep holding -4 °F and the rice cookers.</w:t>
+        <w:t>The case opens Tuesday through Sunday, 11:30 a.m. to 2:30 p.m. and 5:00 to 9:30 p.m., until 10:00 p.m. on Friday and Saturday. Production (the day's sushi rice, cutting the saku blocks and the sauces) is done before opening, so the head sushi chef and the line cook start at 8:30 a.m., three hours before the doors open. You need two fish suppliers with their paperwork, supplier letters or farmed-fish statements, and one for sushi rice, nori and sauces with specification sheets. Prices move with the season and the catch, so keep a second quote on hand. Utilities average $1,700 a month, because the gas kitchen and the refrigeration run all day. Maintenance covers the semiannual hood cleaning, the refrigeration, the freezer that has to keep holding -4 °F and the rice cookers.</w:t>
       </w:r>
     </w:p>
     <w:p>
@@ -612,7 +612,7 @@
     </w:p>
     <w:p>
       <w:r>
-        <w:t>Train the team before you open. Food handler cards are required in many states, and the Food Code asks for a Certified Food Protection Manager on site (2-102.12). With raw fish the training has to cover parasite destruction records, sushi case temperatures, the time control or pH log for the rice, the nine major allergens and cross-contact. The bar needs its own training in cutting and in the grams of neta and shari. Separately, workplace safety covers cuts from the bar knives, burns from the fryer and the griddle, the cold of the freezer and heavy lifting.</w:t>
+        <w:t>Train the team before you open. Food handler cards are required in many states, and the Food Code asks for a Certified Food Protection Manager on site (2-102.12). With raw fish the training has to cover parasite destruction records, sushi case temperatures, the time control or pH log for the rice, the nine major allergens and cross-contact. The bar needs its own training in cutting and in the ounces of neta and shari. Separately, workplace safety covers cuts from the bar knives, burns from the fryer and the griddle, the cold of the freezer and heavy lifting.</w:t>
       </w:r>
     </w:p>
     <w:p>
@@ -696,7 +696,7 @@
     </w:p>
     <w:p>
       <w:r>
-        <w:t>Raw fish is the sensitive point. Under the FDA Food Code 2022 (3-402.11; each state adopts its own edition), fish served raw or undercooked must be frozen first: at -4 °F (-20 °C) or below for 7 days (168 hours), or at -31 °F until solid and held for 15 hours, or at -31 °F until solid and then held at -4 °F or below for the 24-hour option. Two groups are exempt: tuna of the Thunnus species (yellowfin, bigeye, bluefin, albacore) and farmed fish fed pellet feed, such as salmon, both with a written statement from the supplier or the farmer. Freezing records are kept 90 days (3-402.12). The kit's SOP is to buy fish already treated, with the supplier letter on file, and to use the -4 °F freezer for that stock. Farmed hamachi, mackerel (saba), squid and wild fish need a supplier letter or your own freezing with records. "Sushi-grade" has no legal definition, so do not promise it. Tuna, yellowtail and mackerel carry histamine: receive them at 40 °F or below or reject them (FDA Fish and Fishery Products Hazards and Controls Guidance).</w:t>
+        <w:t>Raw fish is the sensitive point. Under the FDA Food Code 2022 (3-402.11; each state adopts its own edition), fish served raw or undercooked must be frozen first: at -4 °F (-20 °C) or below for 7 days (168 hours), or at -31 °F until solid and held for 15 hours, or at -31 °F until solid and then held at -4 °F or below for the 24-hour option. Besides bivalves and roe removed from the skein and rinsed, two groups are exempt: tuna of the Thunnus species (yellowfin, bigeye, bluefin, albacore) and farmed fish fed pellet feed, such as salmon; the farmed fish need a written statement from the supplier or the farmer, and the kit also files the tuna invoice that names the species. Freezing records are kept 90 days (3-402.12). The kit's SOP is to buy fish already treated, with the supplier letter on file, and to use the -4 °F freezer for that stock. Farmed hamachi, mackerel (saba), squid and wild fish need a supplier letter or your own freezing with records. "Sushi-grade" has no legal definition, so do not promise it. Tuna, yellowtail and mackerel carry histamine: receive them at 40 °F or below or reject them (FDA Fish and Fishery Products Hazards and Controls Guidance).</w:t>
       </w:r>
     </w:p>
     <w:p>
@@ -753,7 +753,7 @@
     </w:p>
     <w:p>
       <w:r>
-        <w:t>The seventh is pricing a platter without costing it by channel: the same 24-piece platter leaves far less margin when it goes out through a marketplace than when it is sold dine-in. The eighth is depending on one fish supplier: two, with their paperwork, are the insurance of the bar. The ninth is incomplete allergens: sesame, soy and wheat are in the sauces, the tempura and the imitation crab, as well as the fish itself. A matrix by dish, made before opening and reviewed whenever you change a supplier or a sauce, avoids the scare.</w:t>
+        <w:t>The seventh is pricing a platter without costing it by channel: the same 24-piece platter leaves about a fifth less margin when it goes out through a marketplace than when it is sold dine-in ($24.83 against $31.60 with the calculator's defaults). The eighth is depending on one fish supplier: two, with their paperwork, are the insurance of the bar. The ninth is incomplete allergens: sesame, soy and wheat are in the sauces, the tempura and the imitation crab, as well as the fish itself. A matrix by dish, made before opening and reviewed whenever you change a supplier or a sauce, avoids the scare.</w:t>
       </w:r>
     </w:p>
     <w:p>

</xml_diff>